<commit_message>
Restore original 6BCW experiment protocols and ticker table timing
Co-authored-by: arena-agent <297053741+arena-agent@users.noreply.github.com>
</commit_message>
<xml_diff>
--- a/Bestellijst_nieuw_materiaal_6BCW.docx
+++ b/Bestellijst_nieuw_materiaal_6BCW.docx
@@ -712,6 +712,96 @@
                 <w:rFonts w:ascii="Calibri" w:hAnsi="Calibri"/>
                 <w:sz w:val="18"/>
               </w:rPr>
+              <w:t>Twee stabiele smartphonehouders + twee verticale meetlatten per groep (handmatige verticale worp)</w:t>
+            </w:r>
+          </w:p>
+        </w:tc>
+        <w:tc>
+          <w:tcPr>
+            <w:tcW w:type="dxa" w:w="1350"/>
+          </w:tcPr>
+          <w:p>
+            <w:pPr>
+              <w:spacing w:after="20" w:before="20"/>
+            </w:pPr>
+            <w:r>
+              <w:rPr>
+                <w:rFonts w:ascii="Calibri" w:hAnsi="Calibri"/>
+                <w:sz w:val="18"/>
+              </w:rPr>
+              <w:t>8 sets</w:t>
+            </w:r>
+          </w:p>
+        </w:tc>
+        <w:tc>
+          <w:tcPr>
+            <w:tcW w:type="dxa" w:w="1550"/>
+          </w:tcPr>
+          <w:p>
+            <w:pPr>
+              <w:spacing w:after="20" w:before="20"/>
+            </w:pPr>
+            <w:r>
+              <w:rPr>
+                <w:rFonts w:ascii="Calibri" w:hAnsi="Calibri"/>
+                <w:sz w:val="18"/>
+              </w:rPr>
+              <w:t>offerte / voorraad</w:t>
+            </w:r>
+          </w:p>
+        </w:tc>
+        <w:tc>
+          <w:tcPr>
+            <w:tcW w:type="dxa" w:w="2500"/>
+          </w:tcPr>
+          <w:p>
+            <w:pPr>
+              <w:spacing w:after="20" w:before="20"/>
+            </w:pPr>
+            <w:r>
+              <w:rPr>
+                <w:rFonts w:ascii="Calibri" w:hAnsi="Calibri"/>
+                <w:sz w:val="18"/>
+              </w:rPr>
+              <w:t>schoolvoorraad / schoolleverancier</w:t>
+            </w:r>
+          </w:p>
+        </w:tc>
+        <w:tc>
+          <w:tcPr>
+            <w:tcW w:type="dxa" w:w="1138"/>
+          </w:tcPr>
+          <w:p>
+            <w:pPr>
+              <w:spacing w:after="20" w:before="20"/>
+            </w:pPr>
+            <w:r>
+              <w:rPr>
+                <w:rFonts w:ascii="Calibri" w:hAnsi="Calibri"/>
+                <w:sz w:val="18"/>
+              </w:rPr>
+              <w:t>☐</w:t>
+            </w:r>
+          </w:p>
+        </w:tc>
+      </w:tr>
+      <w:tr>
+        <w:trPr>
+          <w:trHeight w:val="330" w:hRule="atLeast"/>
+        </w:trPr>
+        <w:tc>
+          <w:tcPr>
+            <w:tcW w:type="dxa" w:w="3100"/>
+          </w:tcPr>
+          <w:p>
+            <w:pPr>
+              <w:spacing w:after="20" w:before="20"/>
+            </w:pPr>
+            <w:r>
+              <w:rPr>
+                <w:rFonts w:ascii="Calibri" w:hAnsi="Calibri"/>
+                <w:sz w:val="18"/>
+              </w:rPr>
               <w:t>Plexiglazen balkjes + spelden (optica)</w:t>
             </w:r>
           </w:p>

</xml_diff>